<commit_message>
Inject certifications registry from resume and link docx download path
</commit_message>
<xml_diff>
--- a/Bhoomi Jain.docx
+++ b/Bhoomi Jain.docx
@@ -598,25 +598,7 @@
           <w:b/>
           <w:bCs/>
         </w:rPr>
-        <w:t xml:space="preserve">Sant </w:t>
-      </w:r>
-      <w:proofErr w:type="spellStart"/>
-      <w:r>
-        <w:rPr>
-          <w:rFonts w:ascii="Times New Roman" w:hAnsi="Times New Roman" w:cs="Times New Roman"/>
-          <w:b/>
-          <w:bCs/>
-        </w:rPr>
-        <w:t>Hirdaram</w:t>
-      </w:r>
-      <w:proofErr w:type="spellEnd"/>
-      <w:r>
-        <w:rPr>
-          <w:rFonts w:ascii="Times New Roman" w:hAnsi="Times New Roman" w:cs="Times New Roman"/>
-          <w:b/>
-          <w:bCs/>
-        </w:rPr>
-        <w:t xml:space="preserve"> Girls College</w:t>
+        <w:t>Sant Hirdaram Girls College</w:t>
       </w:r>
       <w:r>
         <w:rPr>
@@ -938,7 +920,6 @@
         </w:rPr>
         <w:tab/>
       </w:r>
-      <w:proofErr w:type="gramStart"/>
       <w:r>
         <w:rPr>
           <w:rFonts w:ascii="Times New Roman" w:hAnsi="Times New Roman" w:cs="Times New Roman"/>
@@ -956,7 +937,6 @@
         </w:rPr>
         <w:t>2021</w:t>
       </w:r>
-      <w:proofErr w:type="gramEnd"/>
     </w:p>
     <w:p>
       <w:pPr>
@@ -1029,27 +1009,7 @@
           <w:sz w:val="20"/>
           <w:szCs w:val="20"/>
         </w:rPr>
-        <w:t>(</w:t>
-      </w:r>
-      <w:r>
-        <w:rPr>
-          <w:rFonts w:ascii="Times New Roman" w:hAnsi="Times New Roman" w:cs="Times New Roman"/>
-          <w:b/>
-          <w:bCs/>
-          <w:sz w:val="20"/>
-          <w:szCs w:val="20"/>
-        </w:rPr>
-        <w:t>https://github.com/bhoomi9589/-Power_BI_Dashboards</w:t>
-      </w:r>
-      <w:r>
-        <w:rPr>
-          <w:rFonts w:ascii="Times New Roman" w:hAnsi="Times New Roman" w:cs="Times New Roman"/>
-          <w:b/>
-          <w:bCs/>
-          <w:sz w:val="20"/>
-          <w:szCs w:val="20"/>
-        </w:rPr>
-        <w:t>)</w:t>
+        <w:t>(https://github.com/bhoomi9589/-Power_BI_Dashboards)</w:t>
       </w:r>
     </w:p>
     <w:p>
@@ -1437,25 +1397,7 @@
           <w:sz w:val="22"/>
           <w:szCs w:val="22"/>
         </w:rPr>
-        <w:t xml:space="preserve">Integrated </w:t>
-      </w:r>
-      <w:proofErr w:type="spellStart"/>
-      <w:r>
-        <w:rPr>
-          <w:rFonts w:ascii="Times New Roman" w:hAnsi="Times New Roman" w:cs="Times New Roman"/>
-          <w:sz w:val="22"/>
-          <w:szCs w:val="22"/>
-        </w:rPr>
-        <w:t>Joblib</w:t>
-      </w:r>
-      <w:proofErr w:type="spellEnd"/>
-      <w:r>
-        <w:rPr>
-          <w:rFonts w:ascii="Times New Roman" w:hAnsi="Times New Roman" w:cs="Times New Roman"/>
-          <w:sz w:val="22"/>
-          <w:szCs w:val="22"/>
-        </w:rPr>
-        <w:t xml:space="preserve"> for low-latency model inference and embedded dynamic Google Maps location data into the user interface</w:t>
+        <w:t>Integrated Joblib for low-latency model inference and embedded dynamic Google Maps location data into the user interface</w:t>
       </w:r>
       <w:r>
         <w:rPr>
@@ -1511,27 +1453,7 @@
           <w:sz w:val="20"/>
           <w:szCs w:val="20"/>
         </w:rPr>
-        <w:t>(</w:t>
-      </w:r>
-      <w:r>
-        <w:rPr>
-          <w:rFonts w:ascii="Times New Roman" w:hAnsi="Times New Roman" w:cs="Times New Roman"/>
-          <w:b/>
-          <w:bCs/>
-          <w:sz w:val="20"/>
-          <w:szCs w:val="20"/>
-        </w:rPr>
-        <w:t>https://github.com/bhoomi9589/Calorie_Nutrition_Tracker</w:t>
-      </w:r>
-      <w:r>
-        <w:rPr>
-          <w:rFonts w:ascii="Times New Roman" w:hAnsi="Times New Roman" w:cs="Times New Roman"/>
-          <w:b/>
-          <w:bCs/>
-          <w:sz w:val="20"/>
-          <w:szCs w:val="20"/>
-        </w:rPr>
-        <w:t>)</w:t>
+        <w:t>(https://github.com/bhoomi9589/Calorie_Nutrition_Tracker)</w:t>
       </w:r>
     </w:p>
     <w:p>
@@ -1554,25 +1476,7 @@
           <w:sz w:val="22"/>
           <w:szCs w:val="22"/>
         </w:rPr>
-        <w:t xml:space="preserve">Built a full-stack web application integrating the </w:t>
-      </w:r>
-      <w:proofErr w:type="spellStart"/>
-      <w:r>
-        <w:rPr>
-          <w:rFonts w:ascii="Times New Roman" w:hAnsi="Times New Roman" w:cs="Times New Roman"/>
-          <w:sz w:val="22"/>
-          <w:szCs w:val="22"/>
-        </w:rPr>
-        <w:t>Spoonacular</w:t>
-      </w:r>
-      <w:proofErr w:type="spellEnd"/>
-      <w:r>
-        <w:rPr>
-          <w:rFonts w:ascii="Times New Roman" w:hAnsi="Times New Roman" w:cs="Times New Roman"/>
-          <w:sz w:val="22"/>
-          <w:szCs w:val="22"/>
-        </w:rPr>
-        <w:t xml:space="preserve"> REST API to fetch and log real-time nutritional data for thousands of food items. </w:t>
+        <w:t xml:space="preserve">Built a full-stack web application integrating the Spoonacular REST API to fetch and log real-time nutritional data for thousands of food items. </w:t>
       </w:r>
     </w:p>
     <w:p>
@@ -1613,33 +1517,15 @@
           <w:b/>
           <w:bCs/>
         </w:rPr>
-        <w:t xml:space="preserve">Diabetes </w:t>
-      </w:r>
-      <w:proofErr w:type="gramStart"/>
-      <w:r>
-        <w:rPr>
-          <w:rFonts w:ascii="Times New Roman" w:hAnsi="Times New Roman" w:cs="Times New Roman"/>
-          <w:b/>
-          <w:bCs/>
-        </w:rPr>
-        <w:t xml:space="preserve">Predictor </w:t>
-      </w:r>
-      <w:r>
-        <w:rPr>
-          <w:rFonts w:ascii="Times New Roman" w:hAnsi="Times New Roman" w:cs="Times New Roman"/>
-          <w:sz w:val="22"/>
-          <w:szCs w:val="22"/>
-        </w:rPr>
-        <w:t xml:space="preserve"> |</w:t>
-      </w:r>
-      <w:proofErr w:type="gramEnd"/>
-      <w:r>
-        <w:rPr>
-          <w:rFonts w:ascii="Times New Roman" w:hAnsi="Times New Roman" w:cs="Times New Roman"/>
-          <w:sz w:val="22"/>
-          <w:szCs w:val="22"/>
-        </w:rPr>
-        <w:t xml:space="preserve"> Python, Scikit-Learn, Pandas, NumPy, Matplotlib</w:t>
+        <w:t xml:space="preserve">Diabetes Predictor </w:t>
+      </w:r>
+      <w:r>
+        <w:rPr>
+          <w:rFonts w:ascii="Times New Roman" w:hAnsi="Times New Roman" w:cs="Times New Roman"/>
+          <w:sz w:val="22"/>
+          <w:szCs w:val="22"/>
+        </w:rPr>
+        <w:t xml:space="preserve"> | Python, Scikit-Learn, Pandas, NumPy, Matplotlib</w:t>
       </w:r>
     </w:p>
     <w:p>
@@ -1661,27 +1547,7 @@
           <w:sz w:val="20"/>
           <w:szCs w:val="20"/>
         </w:rPr>
-        <w:t>(</w:t>
-      </w:r>
-      <w:r>
-        <w:rPr>
-          <w:rFonts w:ascii="Times New Roman" w:hAnsi="Times New Roman" w:cs="Times New Roman"/>
-          <w:b/>
-          <w:bCs/>
-          <w:sz w:val="20"/>
-          <w:szCs w:val="20"/>
-        </w:rPr>
-        <w:t>https://github.com/bhoomi9589/diabetes_predictor</w:t>
-      </w:r>
-      <w:r>
-        <w:rPr>
-          <w:rFonts w:ascii="Times New Roman" w:hAnsi="Times New Roman" w:cs="Times New Roman"/>
-          <w:b/>
-          <w:bCs/>
-          <w:sz w:val="20"/>
-          <w:szCs w:val="20"/>
-        </w:rPr>
-        <w:t>)</w:t>
+        <w:t>(https://github.com/bhoomi9589/diabetes_predictor)</w:t>
       </w:r>
     </w:p>
     <w:p>
@@ -1984,18 +1850,8 @@
           <w:sz w:val="22"/>
           <w:szCs w:val="22"/>
         </w:rPr>
-        <w:t xml:space="preserve"> | </w:t>
-      </w:r>
-      <w:proofErr w:type="spellStart"/>
-      <w:r>
-        <w:rPr>
-          <w:rFonts w:ascii="Times New Roman" w:hAnsi="Times New Roman" w:cs="Times New Roman"/>
-          <w:sz w:val="22"/>
-          <w:szCs w:val="22"/>
-        </w:rPr>
-        <w:t>Netligent</w:t>
-      </w:r>
-      <w:proofErr w:type="spellEnd"/>
+        <w:t xml:space="preserve"> | Netligent</w:t>
+      </w:r>
       <w:r>
         <w:rPr>
           <w:rFonts w:ascii="Times New Roman" w:hAnsi="Times New Roman" w:cs="Times New Roman"/>
@@ -2003,6 +1859,14 @@
           <w:szCs w:val="22"/>
         </w:rPr>
         <w:t xml:space="preserve"> Technologies</w:t>
+      </w:r>
+      <w:r>
+        <w:rPr>
+          <w:rFonts w:ascii="Times New Roman" w:hAnsi="Times New Roman" w:cs="Times New Roman"/>
+          <w:sz w:val="22"/>
+          <w:szCs w:val="22"/>
+        </w:rPr>
+        <w:t xml:space="preserve"> LLP</w:t>
       </w:r>
     </w:p>
     <w:sectPr>

</xml_diff>